<commit_message>
Almost done with sprint2
</commit_message>
<xml_diff>
--- a/Proposals (Sprint1)/Sprint1.docx
+++ b/Proposals (Sprint1)/Sprint1.docx
@@ -841,15 +841,18 @@
           <w:p>
             <w:pPr>
               <w:spacing w:before="60" w:after="60"/>
-            </w:pPr>
-            <w:r>
-              <w:rPr>
-                <w:rFonts w:cs="Times New Roman"/>
-                <w:color w:val="1A7A5E"/>
+              <w:rPr>
+                <w:lang w:val="vi-VN"/>
+              </w:rPr>
+            </w:pPr>
+            <w:r>
+              <w:rPr>
+                <w:rFonts w:cs="Times New Roman"/>
+                <w:color w:val="1F4E8C"/>
                 <w:sz w:val="20"/>
                 <w:szCs w:val="20"/>
               </w:rPr>
-              <w:t>UC2: System Management (Vehicles, Stations, Users)</w:t>
+              <w:t>UC1: Process Rentals, Payment &amp; Admin Dashboard</w:t>
             </w:r>
           </w:p>
         </w:tc>
@@ -1002,15 +1005,22 @@
           <w:p>
             <w:pPr>
               <w:spacing w:before="60" w:after="60"/>
-            </w:pPr>
-            <w:r>
-              <w:rPr>
-                <w:rFonts w:cs="Times New Roman"/>
-                <w:color w:val="1F4E8C"/>
+              <w:rPr>
+                <w:rFonts w:cs="Times New Roman"/>
+                <w:color w:val="1A7A5E"/>
                 <w:sz w:val="20"/>
                 <w:szCs w:val="20"/>
-              </w:rPr>
-              <w:t>UC1: Process Rentals, Payment &amp; Admin Dashboard</w:t>
+                <w:lang w:val="vi-VN"/>
+              </w:rPr>
+            </w:pPr>
+            <w:r>
+              <w:rPr>
+                <w:rFonts w:cs="Times New Roman"/>
+                <w:color w:val="1A7A5E"/>
+                <w:sz w:val="20"/>
+                <w:szCs w:val="20"/>
+              </w:rPr>
+              <w:t>UC2: System Management (Vehicles, Stations, Users)</w:t>
             </w:r>
           </w:p>
         </w:tc>

</xml_diff>